<commit_message>
Edição de dados no trabalho e add img UML
</commit_message>
<xml_diff>
--- a/docs/detalhesProjeto/AEP Horta - Finalizado.docx
+++ b/docs/detalhesProjeto/AEP Horta - Finalizado.docx
@@ -1086,7 +1086,7 @@
                 <w:szCs w:val="20"/>
                 <w:rtl w:val="0"/>
               </w:rPr>
-              <w:t xml:space="preserve"> os terrenos disponíveis sejam mantidos de forma or</w:t>
+              <w:t xml:space="preserve"> os terrenos disponíveis sejam mantidos de forma organizada</w:t>
             </w:r>
           </w:p>
         </w:tc>
@@ -2195,7 +2195,7 @@
           <w:szCs w:val="24"/>
           <w:rtl w:val="0"/>
         </w:rPr>
-        <w:t xml:space="preserve">ESTRUTURAÇÃO DO GITHUB E DIAGRAMAS Diagramação - Matheus</w:t>
+        <w:t xml:space="preserve">ESTRUTURAÇÃO DO GITHUB E DIAGRAMAS Diagramação</w:t>
       </w:r>
     </w:p>
     <w:p>

</xml_diff>